<commit_message>
feat: add automation tool to convert Markdown protocols to Google Docs with embedded comments
</commit_message>
<xml_diff>
--- a/templates/intervention-review/filters/reference.docx
+++ b/templates/intervention-review/filters/reference.docx
@@ -485,7 +485,7 @@
   <w:docDefaults>
     <w:rPrDefault>
       <w:rPr>
-        <w:rFonts w:asciiTheme="minorHAnsi" w:eastAsiaTheme="minorEastAsia" w:hAnsiTheme="minorHAnsi" w:cstheme="minorBidi"/>
+        <w:rFonts w:ascii="Times New Roman" w:hAnsi="Times New Roman" w:eastAsia="MS Mincho" w:cs="Times New Roman"/>
         <w:sz w:val="24"/>
         <w:szCs w:val="24"/>
         <w:lang w:val="en-US" w:eastAsia="zh-CN" w:bidi="ar-SA"/>
@@ -493,7 +493,7 @@
     </w:rPrDefault>
     <w:pPrDefault>
       <w:pPr>
-        <w:spacing w:after="200"/>
+        <w:spacing w:line="360" w:lineRule="auto" w:before="0" w:after="0"/>
       </w:pPr>
     </w:pPrDefault>
   </w:docDefaults>
@@ -1134,6 +1134,28 @@
       <w:b w:val="0"/>
       <w:bCs w:val="0"/>
       <w:color w:val="365F91" w:themeColor="accent1" w:themeShade="BF"/>
+    </w:rPr>
+  </w:style>
+  <w:style w:type="paragraph" w:customStyle="1" w:styleId="Note">
+    <w:name w:val="Note"/>
+    <w:basedOn w:val="Normal"/>
+    <w:qFormat/>
+    <w:pPr>
+      <w:pBdr>
+        <w:left w:val="single" w:sz="18" w:space="6" w:color="4FC3F7"/>
+      </w:pBdr>
+      <w:ind w:left="240"/>
+    </w:pPr>
+    <w:rPr>
+      <w:color w:val="4FC3F7"/>
+    </w:rPr>
+  </w:style>
+  <w:style w:type="character" w:customStyle="1" w:styleId="Placeholder">
+    <w:name w:val="Placeholder"/>
+    <w:qFormat/>
+    <w:rPr>
+      <w:b/>
+      <w:color w:val="4FC3F7"/>
     </w:rPr>
   </w:style>
 </w:styles>

</xml_diff>